<commit_message>
Add monthly report, GBP audit, speed-to-lead sheet, and form updates to both packages
- Updated both subscription packages on website with 4 new included items
- Rewrote Part 3 of value prop doc to be fact-based market research (not instructional)
- Added Steps 4–7 to Part 2: Speed-to-Lead Facts Sheet, Monthly Summary, GBP Audit, Form Maintenance
- Expanded comparison table in Part 4 with new differentiators

Co-Authored-By: Claude Sonnet 4.6 <noreply@anthropic.com>
</commit_message>
<xml_diff>
--- a/Lead Management Subscription — Value Proposition.docx
+++ b/Lead Management Subscription — Value Proposition.docx
@@ -233,7 +233,7 @@
                 <w:color w:val="1C1C1A"/>
                 <w:sz w:val="22"/>
               </w:rPr>
-              <w:t>Every deliverable, running every month, on your behalf</w:t>
+              <w:t>Every deliverable — all seven, running every month, on your behalf</w:t>
             </w:r>
           </w:p>
         </w:tc>
@@ -265,7 +265,7 @@
                 <w:color w:val="1A3A2A"/>
                 <w:sz w:val="22"/>
               </w:rPr>
-              <w:t>Part 3 — What You Do With Your Leads</w:t>
+              <w:t>Part 3 — Speed to Lead: The Market Reality</w:t>
             </w:r>
           </w:p>
         </w:tc>
@@ -294,7 +294,7 @@
                 <w:color w:val="1C1C1A"/>
                 <w:sz w:val="22"/>
               </w:rPr>
-              <w:t>How to respond fast and close more from the leads we send</w:t>
+              <w:t>The research behind response time and what it means for your close rate</w:t>
             </w:r>
           </w:p>
         </w:tc>
@@ -1133,7 +1133,38 @@
           <w:color w:val="1A3A2A"/>
           <w:sz w:val="28"/>
         </w:rPr>
-        <w:t>Step 4 — Monthly Lead Summary</w:t>
+        <w:t>Step 4 — Speed-to-Lead Facts Sheet (Included at Onboarding)</w:t>
+      </w:r>
+    </w:p>
+    <w:p>
+      <w:pPr>
+        <w:spacing w:before="0" w:after="120"/>
+      </w:pPr>
+      <w:r>
+        <w:rPr>
+          <w:rFonts w:ascii="Arial" w:hAnsi="Arial"/>
+          <w:color w:val="1C1C1A"/>
+          <w:sz w:val="22"/>
+        </w:rPr>
+        <w:t>At the start of your subscription, we send you a one-page Speed-to-Lead Facts Sheet. It is not a how-to guide — it is a breakdown of the market research on lead response behavior in home services: what the data says about how quickly homeowners make hiring decisions, what your competitors are doing (and not doing), and what the numbers show about timing and close rates. Consider it background intelligence on the market you are competing in.</w:t>
+      </w:r>
+    </w:p>
+    <w:p>
+      <w:pPr>
+        <w:jc w:val="left"/>
+        <w:spacing w:before="300" w:after="160"/>
+        <w:pBdr>
+          <w:bottom w:val="single" w:sz="4" w:space="4" w:color="e2e0d8"/>
+        </w:pBdr>
+      </w:pPr>
+      <w:r>
+        <w:rPr>
+          <w:rFonts w:ascii="Arial" w:hAnsi="Arial"/>
+          <w:b/>
+          <w:color w:val="1A3A2A"/>
+          <w:sz w:val="28"/>
+        </w:rPr>
+        <w:t>Step 5 — Monthly Lead Summary</w:t>
       </w:r>
     </w:p>
     <w:p>
@@ -1174,7 +1205,7 @@
           <w:color w:val="1C1C1A"/>
           <w:sz w:val="22"/>
         </w:rPr>
-        <w:t>Which days and times are busiest for your inquiries</w:t>
+        <w:t>Which days and times had the most inquiries</w:t>
       </w:r>
     </w:p>
     <w:p>
@@ -1188,7 +1219,7 @@
           <w:color w:val="1C1C1A"/>
           <w:sz w:val="22"/>
         </w:rPr>
-        <w:t>Any notes or recommendations from our side</w:t>
+        <w:t>Any notes or observations from our side</w:t>
       </w:r>
     </w:p>
     <w:p>
@@ -1201,7 +1232,7 @@
           <w:color w:val="1C1C1A"/>
           <w:sz w:val="22"/>
         </w:rPr>
-        <w:t>This is your proof that the system is working. You will always know exactly what your subscription is doing for you.</w:t>
+        <w:t>This is your proof that the system is working. You will always know exactly what your subscription is doing for you — no guessing, no logging in anywhere.</w:t>
       </w:r>
     </w:p>
     <w:p>
@@ -1219,7 +1250,38 @@
           <w:color w:val="1A3A2A"/>
           <w:sz w:val="28"/>
         </w:rPr>
-        <w:t>Step 5 — Ongoing Maintenance (Included, No Extra Charge)</w:t>
+        <w:t>Step 6 — Google Business Profile Audit (Quarterly)</w:t>
+      </w:r>
+    </w:p>
+    <w:p>
+      <w:pPr>
+        <w:spacing w:before="0" w:after="120"/>
+      </w:pPr>
+      <w:r>
+        <w:rPr>
+          <w:rFonts w:ascii="Arial" w:hAnsi="Arial"/>
+          <w:color w:val="1C1C1A"/>
+          <w:sz w:val="22"/>
+        </w:rPr>
+        <w:t>Google Business Profile is the single biggest driver of free local leads for home service businesses — it determines whether you appear when someone nearby searches for what you do. Most business owners set it up once and never revisit it. Every quarter, we review yours and flag anything that is incomplete, outdated, or costing you visibility: category accuracy, service areas, photos, hours, and Q&amp;A. No extra charge.</w:t>
+      </w:r>
+    </w:p>
+    <w:p>
+      <w:pPr>
+        <w:jc w:val="left"/>
+        <w:spacing w:before="300" w:after="160"/>
+        <w:pBdr>
+          <w:bottom w:val="single" w:sz="4" w:space="4" w:color="e2e0d8"/>
+        </w:pBdr>
+      </w:pPr>
+      <w:r>
+        <w:rPr>
+          <w:rFonts w:ascii="Arial" w:hAnsi="Arial"/>
+          <w:b/>
+          <w:color w:val="1A3A2A"/>
+          <w:sz w:val="28"/>
+        </w:rPr>
+        <w:t>Step 7 — Ongoing Maintenance &amp; Form Updates (Always Included)</w:t>
       </w:r>
     </w:p>
     <w:p>
@@ -1246,7 +1308,7 @@
           <w:color w:val="1C1C1A"/>
           <w:sz w:val="22"/>
         </w:rPr>
-        <w:t>Service or price changes on your form — we update it.</w:t>
+        <w:t>Service or price changes on your form — we update it, no charge.</w:t>
       </w:r>
     </w:p>
     <w:p>
@@ -1260,7 +1322,7 @@
           <w:color w:val="1C1C1A"/>
           <w:sz w:val="22"/>
         </w:rPr>
-        <w:t>Technical issues — we fix them before you know there was a problem.</w:t>
+        <w:t>Technical issues — we handle them before you know there was a problem.</w:t>
       </w:r>
     </w:p>
     <w:p>
@@ -1274,21 +1336,7 @@
           <w:color w:val="1C1C1A"/>
           <w:sz w:val="22"/>
         </w:rPr>
-        <w:t>Form optimization — if we see a way to improve how your leads come in, we make it.</w:t>
-      </w:r>
-    </w:p>
-    <w:p>
-      <w:pPr>
-        <w:pStyle w:val="ListBullet"/>
-        <w:spacing w:before="0" w:after="80"/>
-      </w:pPr>
-      <w:r>
-        <w:rPr>
-          <w:rFonts w:ascii="Arial" w:hAnsi="Arial"/>
-          <w:color w:val="1C1C1A"/>
-          <w:sz w:val="22"/>
-        </w:rPr>
-        <w:t>Google Business Profile check (quarterly) — we verify your listing is complete and accurate, since GBP is the top source of free local leads for home service businesses.</w:t>
+        <w:t>Form adjustments — if we see an improvement, we make it.</w:t>
       </w:r>
     </w:p>
     <w:p>
@@ -1641,6 +1689,67 @@
                 <w:color w:val="1A3A2A"/>
                 <w:sz w:val="22"/>
               </w:rPr>
+              <w:t>Speed-to-Lead Facts Sheet</w:t>
+            </w:r>
+          </w:p>
+        </w:tc>
+        <w:tc>
+          <w:tcPr>
+            <w:tcW w:type="dxa" w:w="6480"/>
+            <w:tcMar>
+              <w:top w:w="80" w:type="dxa"/>
+              <w:bottom w:w="80" w:type="dxa"/>
+              <w:left w:w="115" w:type="dxa"/>
+              <w:right w:w="115" w:type="dxa"/>
+            </w:tcMar>
+            <w:tcBorders>
+              <w:top w:val="single" w:sz="4" w:space="0" w:color="D0CEC6"/>
+              <w:left w:val="single" w:sz="4" w:space="0" w:color="D0CEC6"/>
+              <w:bottom w:val="single" w:sz="4" w:space="0" w:color="D0CEC6"/>
+              <w:right w:val="single" w:sz="4" w:space="0" w:color="D0CEC6"/>
+              <w:insideH w:val="single" w:sz="4" w:space="0" w:color="D0CEC6"/>
+              <w:insideV w:val="single" w:sz="4" w:space="0" w:color="D0CEC6"/>
+            </w:tcBorders>
+          </w:tcPr>
+          <w:p>
+            <w:r>
+              <w:rPr>
+                <w:rFonts w:ascii="Arial" w:hAnsi="Arial"/>
+                <w:color w:val="1C1C1A"/>
+                <w:sz w:val="22"/>
+              </w:rPr>
+              <w:t>Market research on lead response sent at onboarding</w:t>
+            </w:r>
+          </w:p>
+        </w:tc>
+      </w:tr>
+      <w:tr>
+        <w:tc>
+          <w:tcPr>
+            <w:tcW w:type="dxa" w:w="2520"/>
+            <w:tcMar>
+              <w:top w:w="80" w:type="dxa"/>
+              <w:bottom w:w="80" w:type="dxa"/>
+              <w:left w:w="115" w:type="dxa"/>
+              <w:right w:w="115" w:type="dxa"/>
+            </w:tcMar>
+            <w:tcBorders>
+              <w:top w:val="single" w:sz="4" w:space="0" w:color="D0CEC6"/>
+              <w:left w:val="single" w:sz="4" w:space="0" w:color="D0CEC6"/>
+              <w:bottom w:val="single" w:sz="4" w:space="0" w:color="D0CEC6"/>
+              <w:right w:val="single" w:sz="4" w:space="0" w:color="D0CEC6"/>
+              <w:insideH w:val="single" w:sz="4" w:space="0" w:color="D0CEC6"/>
+              <w:insideV w:val="single" w:sz="4" w:space="0" w:color="D0CEC6"/>
+            </w:tcBorders>
+          </w:tcPr>
+          <w:p>
+            <w:r>
+              <w:rPr>
+                <w:rFonts w:ascii="Arial" w:hAnsi="Arial"/>
+                <w:b/>
+                <w:color w:val="1A3A2A"/>
+                <w:sz w:val="22"/>
+              </w:rPr>
               <w:t>Monthly lead summary</w:t>
             </w:r>
           </w:p>
@@ -1702,129 +1811,7 @@
                 <w:color w:val="1A3A2A"/>
                 <w:sz w:val="22"/>
               </w:rPr>
-              <w:t>Form updates</w:t>
-            </w:r>
-          </w:p>
-        </w:tc>
-        <w:tc>
-          <w:tcPr>
-            <w:tcW w:type="dxa" w:w="6480"/>
-            <w:tcMar>
-              <w:top w:w="80" w:type="dxa"/>
-              <w:bottom w:w="80" w:type="dxa"/>
-              <w:left w:w="115" w:type="dxa"/>
-              <w:right w:w="115" w:type="dxa"/>
-            </w:tcMar>
-            <w:tcBorders>
-              <w:top w:val="single" w:sz="4" w:space="0" w:color="D0CEC6"/>
-              <w:left w:val="single" w:sz="4" w:space="0" w:color="D0CEC6"/>
-              <w:bottom w:val="single" w:sz="4" w:space="0" w:color="D0CEC6"/>
-              <w:right w:val="single" w:sz="4" w:space="0" w:color="D0CEC6"/>
-              <w:insideH w:val="single" w:sz="4" w:space="0" w:color="D0CEC6"/>
-              <w:insideV w:val="single" w:sz="4" w:space="0" w:color="D0CEC6"/>
-            </w:tcBorders>
-          </w:tcPr>
-          <w:p>
-            <w:r>
-              <w:rPr>
-                <w:rFonts w:ascii="Arial" w:hAnsi="Arial"/>
-                <w:color w:val="1C1C1A"/>
-                <w:sz w:val="22"/>
-              </w:rPr>
-              <w:t>Any changes to your form — included, no extra charge</w:t>
-            </w:r>
-          </w:p>
-        </w:tc>
-      </w:tr>
-      <w:tr>
-        <w:tc>
-          <w:tcPr>
-            <w:tcW w:type="dxa" w:w="2520"/>
-            <w:tcMar>
-              <w:top w:w="80" w:type="dxa"/>
-              <w:bottom w:w="80" w:type="dxa"/>
-              <w:left w:w="115" w:type="dxa"/>
-              <w:right w:w="115" w:type="dxa"/>
-            </w:tcMar>
-            <w:tcBorders>
-              <w:top w:val="single" w:sz="4" w:space="0" w:color="D0CEC6"/>
-              <w:left w:val="single" w:sz="4" w:space="0" w:color="D0CEC6"/>
-              <w:bottom w:val="single" w:sz="4" w:space="0" w:color="D0CEC6"/>
-              <w:right w:val="single" w:sz="4" w:space="0" w:color="D0CEC6"/>
-              <w:insideH w:val="single" w:sz="4" w:space="0" w:color="D0CEC6"/>
-              <w:insideV w:val="single" w:sz="4" w:space="0" w:color="D0CEC6"/>
-            </w:tcBorders>
-          </w:tcPr>
-          <w:p>
-            <w:r>
-              <w:rPr>
-                <w:rFonts w:ascii="Arial" w:hAnsi="Arial"/>
-                <w:b/>
-                <w:color w:val="1A3A2A"/>
-                <w:sz w:val="22"/>
-              </w:rPr>
-              <w:t>Technical maintenance</w:t>
-            </w:r>
-          </w:p>
-        </w:tc>
-        <w:tc>
-          <w:tcPr>
-            <w:tcW w:type="dxa" w:w="6480"/>
-            <w:tcMar>
-              <w:top w:w="80" w:type="dxa"/>
-              <w:bottom w:w="80" w:type="dxa"/>
-              <w:left w:w="115" w:type="dxa"/>
-              <w:right w:w="115" w:type="dxa"/>
-            </w:tcMar>
-            <w:tcBorders>
-              <w:top w:val="single" w:sz="4" w:space="0" w:color="D0CEC6"/>
-              <w:left w:val="single" w:sz="4" w:space="0" w:color="D0CEC6"/>
-              <w:bottom w:val="single" w:sz="4" w:space="0" w:color="D0CEC6"/>
-              <w:right w:val="single" w:sz="4" w:space="0" w:color="D0CEC6"/>
-              <w:insideH w:val="single" w:sz="4" w:space="0" w:color="D0CEC6"/>
-              <w:insideV w:val="single" w:sz="4" w:space="0" w:color="D0CEC6"/>
-            </w:tcBorders>
-          </w:tcPr>
-          <w:p>
-            <w:r>
-              <w:rPr>
-                <w:rFonts w:ascii="Arial" w:hAnsi="Arial"/>
-                <w:color w:val="1C1C1A"/>
-                <w:sz w:val="22"/>
-              </w:rPr>
-              <w:t>We keep it running; you keep working</w:t>
-            </w:r>
-          </w:p>
-        </w:tc>
-      </w:tr>
-      <w:tr>
-        <w:tc>
-          <w:tcPr>
-            <w:tcW w:type="dxa" w:w="2520"/>
-            <w:tcMar>
-              <w:top w:w="80" w:type="dxa"/>
-              <w:bottom w:w="80" w:type="dxa"/>
-              <w:left w:w="115" w:type="dxa"/>
-              <w:right w:w="115" w:type="dxa"/>
-            </w:tcMar>
-            <w:tcBorders>
-              <w:top w:val="single" w:sz="4" w:space="0" w:color="D0CEC6"/>
-              <w:left w:val="single" w:sz="4" w:space="0" w:color="D0CEC6"/>
-              <w:bottom w:val="single" w:sz="4" w:space="0" w:color="D0CEC6"/>
-              <w:right w:val="single" w:sz="4" w:space="0" w:color="D0CEC6"/>
-              <w:insideH w:val="single" w:sz="4" w:space="0" w:color="D0CEC6"/>
-              <w:insideV w:val="single" w:sz="4" w:space="0" w:color="D0CEC6"/>
-            </w:tcBorders>
-          </w:tcPr>
-          <w:p>
-            <w:r>
-              <w:rPr>
-                <w:rFonts w:ascii="Arial" w:hAnsi="Arial"/>
-                <w:b/>
-                <w:color w:val="1A3A2A"/>
-                <w:sz w:val="22"/>
-              </w:rPr>
-              <w:t>GBP quarterly check</w:t>
+              <w:t>GBP audit (quarterly)</w:t>
             </w:r>
           </w:p>
         </w:tc>
@@ -1858,6 +1845,67 @@
           </w:p>
         </w:tc>
       </w:tr>
+      <w:tr>
+        <w:tc>
+          <w:tcPr>
+            <w:tcW w:type="dxa" w:w="2520"/>
+            <w:tcMar>
+              <w:top w:w="80" w:type="dxa"/>
+              <w:bottom w:w="80" w:type="dxa"/>
+              <w:left w:w="115" w:type="dxa"/>
+              <w:right w:w="115" w:type="dxa"/>
+            </w:tcMar>
+            <w:tcBorders>
+              <w:top w:val="single" w:sz="4" w:space="0" w:color="D0CEC6"/>
+              <w:left w:val="single" w:sz="4" w:space="0" w:color="D0CEC6"/>
+              <w:bottom w:val="single" w:sz="4" w:space="0" w:color="D0CEC6"/>
+              <w:right w:val="single" w:sz="4" w:space="0" w:color="D0CEC6"/>
+              <w:insideH w:val="single" w:sz="4" w:space="0" w:color="D0CEC6"/>
+              <w:insideV w:val="single" w:sz="4" w:space="0" w:color="D0CEC6"/>
+            </w:tcBorders>
+          </w:tcPr>
+          <w:p>
+            <w:r>
+              <w:rPr>
+                <w:rFonts w:ascii="Arial" w:hAnsi="Arial"/>
+                <w:b/>
+                <w:color w:val="1A3A2A"/>
+                <w:sz w:val="22"/>
+              </w:rPr>
+              <w:t>Form updates &amp; maintenance</w:t>
+            </w:r>
+          </w:p>
+        </w:tc>
+        <w:tc>
+          <w:tcPr>
+            <w:tcW w:type="dxa" w:w="6480"/>
+            <w:tcMar>
+              <w:top w:w="80" w:type="dxa"/>
+              <w:bottom w:w="80" w:type="dxa"/>
+              <w:left w:w="115" w:type="dxa"/>
+              <w:right w:w="115" w:type="dxa"/>
+            </w:tcMar>
+            <w:tcBorders>
+              <w:top w:val="single" w:sz="4" w:space="0" w:color="D0CEC6"/>
+              <w:left w:val="single" w:sz="4" w:space="0" w:color="D0CEC6"/>
+              <w:bottom w:val="single" w:sz="4" w:space="0" w:color="D0CEC6"/>
+              <w:right w:val="single" w:sz="4" w:space="0" w:color="D0CEC6"/>
+              <w:insideH w:val="single" w:sz="4" w:space="0" w:color="D0CEC6"/>
+              <w:insideV w:val="single" w:sz="4" w:space="0" w:color="D0CEC6"/>
+            </w:tcBorders>
+          </w:tcPr>
+          <w:p>
+            <w:r>
+              <w:rPr>
+                <w:rFonts w:ascii="Arial" w:hAnsi="Arial"/>
+                <w:color w:val="1C1C1A"/>
+                <w:sz w:val="22"/>
+              </w:rPr>
+              <w:t>Any changes to your form or system — included, no extra charge</w:t>
+            </w:r>
+          </w:p>
+        </w:tc>
+      </w:tr>
     </w:tbl>
     <w:p/>
     <w:p>
@@ -1875,7 +1923,7 @@
           <w:color w:val="1A3A2A"/>
           <w:sz w:val="36"/>
         </w:rPr>
-        <w:t>Part 3 — What You Do With Your Leads</w:t>
+        <w:t>Part 3 — Speed to Lead: The Market Reality</w:t>
       </w:r>
     </w:p>
     <w:p>
@@ -1888,7 +1936,7 @@
           <w:color w:val="1C1C1A"/>
           <w:sz w:val="22"/>
         </w:rPr>
-        <w:t>The subscription handles capture and delivery. What happens next is up to you — and the faster you move, the more you win.</w:t>
+        <w:t>This section is not about tactics — it is about understanding the market your business operates in. The research on how homeowners hire contractors tells a consistent story, and it is worth knowing the numbers.</w:t>
       </w:r>
     </w:p>
     <w:p>
@@ -1906,7 +1954,7 @@
           <w:color w:val="1A3A2A"/>
           <w:sz w:val="28"/>
         </w:rPr>
-        <w:t>The 5-Minute Rule</w:t>
+        <w:t>How Homeowners Actually Make Hiring Decisions</w:t>
       </w:r>
     </w:p>
     <w:p>
@@ -1919,63 +1967,7 @@
           <w:color w:val="1C1C1A"/>
           <w:sz w:val="22"/>
         </w:rPr>
-        <w:t>Research shows that responding to a web lead within 5 minutes makes you up to 100 times more likely to qualify that lead than if you wait an hour. Here is what a fast response looks like:</w:t>
-      </w:r>
-    </w:p>
-    <w:p>
-      <w:pPr>
-        <w:pStyle w:val="ListBullet"/>
-        <w:spacing w:before="0" w:after="80"/>
-      </w:pPr>
-      <w:r>
-        <w:rPr>
-          <w:rFonts w:ascii="Arial" w:hAnsi="Arial"/>
-          <w:color w:val="1C1C1A"/>
-          <w:sz w:val="22"/>
-        </w:rPr>
-        <w:t>You get the text. You call the number right away — even if it goes to voicemail.</w:t>
-      </w:r>
-    </w:p>
-    <w:p>
-      <w:pPr>
-        <w:pStyle w:val="ListBullet"/>
-        <w:spacing w:before="0" w:after="80"/>
-      </w:pPr>
-      <w:r>
-        <w:rPr>
-          <w:rFonts w:ascii="Arial" w:hAnsi="Arial"/>
-          <w:color w:val="1C1C1A"/>
-          <w:sz w:val="22"/>
-        </w:rPr>
-        <w:t>Leave a brief message: your name, your business, that you saw their request and want to help.</w:t>
-      </w:r>
-    </w:p>
-    <w:p>
-      <w:pPr>
-        <w:pStyle w:val="ListBullet"/>
-        <w:spacing w:before="0" w:after="80"/>
-      </w:pPr>
-      <w:r>
-        <w:rPr>
-          <w:rFonts w:ascii="Arial" w:hAnsi="Arial"/>
-          <w:color w:val="1C1C1A"/>
-          <w:sz w:val="22"/>
-        </w:rPr>
-        <w:t>Send a follow-up text if they do not answer: "Hi [Name], this is [Your Name] from [Business]. Saw your request — happy to help. When is a good time to talk?"</w:t>
-      </w:r>
-    </w:p>
-    <w:p>
-      <w:pPr>
-        <w:pStyle w:val="ListBullet"/>
-        <w:spacing w:before="0" w:after="80"/>
-      </w:pPr>
-      <w:r>
-        <w:rPr>
-          <w:rFonts w:ascii="Arial" w:hAnsi="Arial"/>
-          <w:color w:val="1C1C1A"/>
-          <w:sz w:val="22"/>
-        </w:rPr>
-        <w:t>If no response in 24 hours, follow up once more. Then move on.</w:t>
+        <w:t>When a homeowner needs a home service — a repair, an install, a cleanup — the typical behavior is not to research multiple companies carefully and choose the best one. It is to submit one or two inquiries and respond to whoever contacts them first. The decision often happens within minutes of that first contact, not hours.</w:t>
       </w:r>
     </w:p>
     <w:p>
@@ -1988,7 +1980,445 @@
           <w:color w:val="1C1C1A"/>
           <w:sz w:val="22"/>
         </w:rPr>
-        <w:t>Remember: 78% of customers hire the first contractor who responds. Being 10% cheaper does not matter if someone else called first.</w:t>
+        <w:t>This is well-documented in the research:</w:t>
+      </w:r>
+    </w:p>
+    <w:tbl>
+      <w:tblPr>
+        <w:tblStyle w:val="TableGrid"/>
+        <w:tblW w:type="auto" w:w="0"/>
+        <w:tblLook w:firstColumn="1" w:firstRow="1" w:lastColumn="0" w:lastRow="0" w:noHBand="0" w:noVBand="1" w:val="04A0"/>
+      </w:tblPr>
+      <w:tblGrid>
+        <w:gridCol w:w="4536"/>
+        <w:gridCol w:w="4536"/>
+      </w:tblGrid>
+      <w:tr>
+        <w:tc>
+          <w:tcPr>
+            <w:tcW w:type="dxa" w:w="2520"/>
+            <w:tcMar>
+              <w:top w:w="80" w:type="dxa"/>
+              <w:bottom w:w="80" w:type="dxa"/>
+              <w:left w:w="115" w:type="dxa"/>
+              <w:right w:w="115" w:type="dxa"/>
+            </w:tcMar>
+            <w:shd w:val="clear" w:color="auto" w:fill="2c1f0e"/>
+            <w:tcBorders>
+              <w:top w:val="single" w:sz="4" w:space="0" w:color="D0CEC6"/>
+              <w:left w:val="single" w:sz="4" w:space="0" w:color="D0CEC6"/>
+              <w:bottom w:val="single" w:sz="4" w:space="0" w:color="D0CEC6"/>
+              <w:right w:val="single" w:sz="4" w:space="0" w:color="D0CEC6"/>
+              <w:insideH w:val="single" w:sz="4" w:space="0" w:color="D0CEC6"/>
+              <w:insideV w:val="single" w:sz="4" w:space="0" w:color="D0CEC6"/>
+            </w:tcBorders>
+          </w:tcPr>
+          <w:p>
+            <w:r>
+              <w:rPr>
+                <w:rFonts w:ascii="Arial" w:hAnsi="Arial"/>
+                <w:b/>
+                <w:color w:val="FFFFFF"/>
+                <w:sz w:val="22"/>
+              </w:rPr>
+              <w:t>Finding</w:t>
+            </w:r>
+          </w:p>
+        </w:tc>
+        <w:tc>
+          <w:tcPr>
+            <w:tcW w:type="dxa" w:w="6480"/>
+            <w:tcMar>
+              <w:top w:w="80" w:type="dxa"/>
+              <w:bottom w:w="80" w:type="dxa"/>
+              <w:left w:w="115" w:type="dxa"/>
+              <w:right w:w="115" w:type="dxa"/>
+            </w:tcMar>
+            <w:shd w:val="clear" w:color="auto" w:fill="2c1f0e"/>
+            <w:tcBorders>
+              <w:top w:val="single" w:sz="4" w:space="0" w:color="D0CEC6"/>
+              <w:left w:val="single" w:sz="4" w:space="0" w:color="D0CEC6"/>
+              <w:bottom w:val="single" w:sz="4" w:space="0" w:color="D0CEC6"/>
+              <w:right w:val="single" w:sz="4" w:space="0" w:color="D0CEC6"/>
+              <w:insideH w:val="single" w:sz="4" w:space="0" w:color="D0CEC6"/>
+              <w:insideV w:val="single" w:sz="4" w:space="0" w:color="D0CEC6"/>
+            </w:tcBorders>
+          </w:tcPr>
+          <w:p>
+            <w:r>
+              <w:rPr>
+                <w:rFonts w:ascii="Arial" w:hAnsi="Arial"/>
+                <w:b/>
+                <w:color w:val="FFFFFF"/>
+                <w:sz w:val="22"/>
+              </w:rPr>
+              <w:t>Source Data</w:t>
+            </w:r>
+          </w:p>
+        </w:tc>
+      </w:tr>
+      <w:tr>
+        <w:tc>
+          <w:tcPr>
+            <w:tcW w:type="dxa" w:w="2520"/>
+            <w:tcMar>
+              <w:top w:w="80" w:type="dxa"/>
+              <w:bottom w:w="80" w:type="dxa"/>
+              <w:left w:w="115" w:type="dxa"/>
+              <w:right w:w="115" w:type="dxa"/>
+            </w:tcMar>
+            <w:tcBorders>
+              <w:top w:val="single" w:sz="4" w:space="0" w:color="D0CEC6"/>
+              <w:left w:val="single" w:sz="4" w:space="0" w:color="D0CEC6"/>
+              <w:bottom w:val="single" w:sz="4" w:space="0" w:color="D0CEC6"/>
+              <w:right w:val="single" w:sz="4" w:space="0" w:color="D0CEC6"/>
+              <w:insideH w:val="single" w:sz="4" w:space="0" w:color="D0CEC6"/>
+              <w:insideV w:val="single" w:sz="4" w:space="0" w:color="D0CEC6"/>
+            </w:tcBorders>
+          </w:tcPr>
+          <w:p>
+            <w:r>
+              <w:rPr>
+                <w:rFonts w:ascii="Arial" w:hAnsi="Arial"/>
+                <w:b/>
+                <w:color w:val="1A3A2A"/>
+                <w:sz w:val="22"/>
+              </w:rPr>
+              <w:t>78% of customers hire the first contractor to respond</w:t>
+            </w:r>
+          </w:p>
+        </w:tc>
+        <w:tc>
+          <w:tcPr>
+            <w:tcW w:type="dxa" w:w="6480"/>
+            <w:tcMar>
+              <w:top w:w="80" w:type="dxa"/>
+              <w:bottom w:w="80" w:type="dxa"/>
+              <w:left w:w="115" w:type="dxa"/>
+              <w:right w:w="115" w:type="dxa"/>
+            </w:tcMar>
+            <w:tcBorders>
+              <w:top w:val="single" w:sz="4" w:space="0" w:color="D0CEC6"/>
+              <w:left w:val="single" w:sz="4" w:space="0" w:color="D0CEC6"/>
+              <w:bottom w:val="single" w:sz="4" w:space="0" w:color="D0CEC6"/>
+              <w:right w:val="single" w:sz="4" w:space="0" w:color="D0CEC6"/>
+              <w:insideH w:val="single" w:sz="4" w:space="0" w:color="D0CEC6"/>
+              <w:insideV w:val="single" w:sz="4" w:space="0" w:color="D0CEC6"/>
+            </w:tcBorders>
+          </w:tcPr>
+          <w:p>
+            <w:r>
+              <w:rPr>
+                <w:rFonts w:ascii="Arial" w:hAnsi="Arial"/>
+                <w:color w:val="1C1C1A"/>
+                <w:sz w:val="22"/>
+              </w:rPr>
+              <w:t>Industry-wide finding across home services. Being second rarely results in a booking.</w:t>
+            </w:r>
+          </w:p>
+        </w:tc>
+      </w:tr>
+      <w:tr>
+        <w:tc>
+          <w:tcPr>
+            <w:tcW w:type="dxa" w:w="2520"/>
+            <w:tcMar>
+              <w:top w:w="80" w:type="dxa"/>
+              <w:bottom w:w="80" w:type="dxa"/>
+              <w:left w:w="115" w:type="dxa"/>
+              <w:right w:w="115" w:type="dxa"/>
+            </w:tcMar>
+            <w:tcBorders>
+              <w:top w:val="single" w:sz="4" w:space="0" w:color="D0CEC6"/>
+              <w:left w:val="single" w:sz="4" w:space="0" w:color="D0CEC6"/>
+              <w:bottom w:val="single" w:sz="4" w:space="0" w:color="D0CEC6"/>
+              <w:right w:val="single" w:sz="4" w:space="0" w:color="D0CEC6"/>
+              <w:insideH w:val="single" w:sz="4" w:space="0" w:color="D0CEC6"/>
+              <w:insideV w:val="single" w:sz="4" w:space="0" w:color="D0CEC6"/>
+            </w:tcBorders>
+          </w:tcPr>
+          <w:p>
+            <w:r>
+              <w:rPr>
+                <w:rFonts w:ascii="Arial" w:hAnsi="Arial"/>
+                <w:b/>
+                <w:color w:val="1A3A2A"/>
+                <w:sz w:val="22"/>
+              </w:rPr>
+              <w:t>Lead conversion drops by up to 100x after 5 minutes</w:t>
+            </w:r>
+          </w:p>
+        </w:tc>
+        <w:tc>
+          <w:tcPr>
+            <w:tcW w:type="dxa" w:w="6480"/>
+            <w:tcMar>
+              <w:top w:w="80" w:type="dxa"/>
+              <w:bottom w:w="80" w:type="dxa"/>
+              <w:left w:w="115" w:type="dxa"/>
+              <w:right w:w="115" w:type="dxa"/>
+            </w:tcMar>
+            <w:tcBorders>
+              <w:top w:val="single" w:sz="4" w:space="0" w:color="D0CEC6"/>
+              <w:left w:val="single" w:sz="4" w:space="0" w:color="D0CEC6"/>
+              <w:bottom w:val="single" w:sz="4" w:space="0" w:color="D0CEC6"/>
+              <w:right w:val="single" w:sz="4" w:space="0" w:color="D0CEC6"/>
+              <w:insideH w:val="single" w:sz="4" w:space="0" w:color="D0CEC6"/>
+              <w:insideV w:val="single" w:sz="4" w:space="0" w:color="D0CEC6"/>
+            </w:tcBorders>
+          </w:tcPr>
+          <w:p>
+            <w:r>
+              <w:rPr>
+                <w:rFonts w:ascii="Arial" w:hAnsi="Arial"/>
+                <w:color w:val="1C1C1A"/>
+                <w:sz w:val="22"/>
+              </w:rPr>
+              <w:t>A lead that gets a response in under 5 minutes is dramatically more likely to convert than one that waits even 30 minutes. The window closes fast.</w:t>
+            </w:r>
+          </w:p>
+        </w:tc>
+      </w:tr>
+      <w:tr>
+        <w:tc>
+          <w:tcPr>
+            <w:tcW w:type="dxa" w:w="2520"/>
+            <w:tcMar>
+              <w:top w:w="80" w:type="dxa"/>
+              <w:bottom w:w="80" w:type="dxa"/>
+              <w:left w:w="115" w:type="dxa"/>
+              <w:right w:w="115" w:type="dxa"/>
+            </w:tcMar>
+            <w:tcBorders>
+              <w:top w:val="single" w:sz="4" w:space="0" w:color="D0CEC6"/>
+              <w:left w:val="single" w:sz="4" w:space="0" w:color="D0CEC6"/>
+              <w:bottom w:val="single" w:sz="4" w:space="0" w:color="D0CEC6"/>
+              <w:right w:val="single" w:sz="4" w:space="0" w:color="D0CEC6"/>
+              <w:insideH w:val="single" w:sz="4" w:space="0" w:color="D0CEC6"/>
+              <w:insideV w:val="single" w:sz="4" w:space="0" w:color="D0CEC6"/>
+            </w:tcBorders>
+          </w:tcPr>
+          <w:p>
+            <w:r>
+              <w:rPr>
+                <w:rFonts w:ascii="Arial" w:hAnsi="Arial"/>
+                <w:b/>
+                <w:color w:val="1A3A2A"/>
+                <w:sz w:val="22"/>
+              </w:rPr>
+              <w:t>The average home service business takes 42+ hours to respond to web leads</w:t>
+            </w:r>
+          </w:p>
+        </w:tc>
+        <w:tc>
+          <w:tcPr>
+            <w:tcW w:type="dxa" w:w="6480"/>
+            <w:tcMar>
+              <w:top w:w="80" w:type="dxa"/>
+              <w:bottom w:w="80" w:type="dxa"/>
+              <w:left w:w="115" w:type="dxa"/>
+              <w:right w:w="115" w:type="dxa"/>
+            </w:tcMar>
+            <w:tcBorders>
+              <w:top w:val="single" w:sz="4" w:space="0" w:color="D0CEC6"/>
+              <w:left w:val="single" w:sz="4" w:space="0" w:color="D0CEC6"/>
+              <w:bottom w:val="single" w:sz="4" w:space="0" w:color="D0CEC6"/>
+              <w:right w:val="single" w:sz="4" w:space="0" w:color="D0CEC6"/>
+              <w:insideH w:val="single" w:sz="4" w:space="0" w:color="D0CEC6"/>
+              <w:insideV w:val="single" w:sz="4" w:space="0" w:color="D0CEC6"/>
+            </w:tcBorders>
+          </w:tcPr>
+          <w:p>
+            <w:r>
+              <w:rPr>
+                <w:rFonts w:ascii="Arial" w:hAnsi="Arial"/>
+                <w:color w:val="1C1C1A"/>
+                <w:sz w:val="22"/>
+              </w:rPr>
+              <w:t>Most competitors are not responding quickly. The bar is low — and that is an advantage for any business with a reliable notification system.</w:t>
+            </w:r>
+          </w:p>
+        </w:tc>
+      </w:tr>
+      <w:tr>
+        <w:tc>
+          <w:tcPr>
+            <w:tcW w:type="dxa" w:w="2520"/>
+            <w:tcMar>
+              <w:top w:w="80" w:type="dxa"/>
+              <w:bottom w:w="80" w:type="dxa"/>
+              <w:left w:w="115" w:type="dxa"/>
+              <w:right w:w="115" w:type="dxa"/>
+            </w:tcMar>
+            <w:tcBorders>
+              <w:top w:val="single" w:sz="4" w:space="0" w:color="D0CEC6"/>
+              <w:left w:val="single" w:sz="4" w:space="0" w:color="D0CEC6"/>
+              <w:bottom w:val="single" w:sz="4" w:space="0" w:color="D0CEC6"/>
+              <w:right w:val="single" w:sz="4" w:space="0" w:color="D0CEC6"/>
+              <w:insideH w:val="single" w:sz="4" w:space="0" w:color="D0CEC6"/>
+              <w:insideV w:val="single" w:sz="4" w:space="0" w:color="D0CEC6"/>
+            </w:tcBorders>
+          </w:tcPr>
+          <w:p>
+            <w:r>
+              <w:rPr>
+                <w:rFonts w:ascii="Arial" w:hAnsi="Arial"/>
+                <w:b/>
+                <w:color w:val="1A3A2A"/>
+                <w:sz w:val="22"/>
+              </w:rPr>
+              <w:t>74% of businesses miss the 5-minute window entirely</w:t>
+            </w:r>
+          </w:p>
+        </w:tc>
+        <w:tc>
+          <w:tcPr>
+            <w:tcW w:type="dxa" w:w="6480"/>
+            <w:tcMar>
+              <w:top w:w="80" w:type="dxa"/>
+              <w:bottom w:w="80" w:type="dxa"/>
+              <w:left w:w="115" w:type="dxa"/>
+              <w:right w:w="115" w:type="dxa"/>
+            </w:tcMar>
+            <w:tcBorders>
+              <w:top w:val="single" w:sz="4" w:space="0" w:color="D0CEC6"/>
+              <w:left w:val="single" w:sz="4" w:space="0" w:color="D0CEC6"/>
+              <w:bottom w:val="single" w:sz="4" w:space="0" w:color="D0CEC6"/>
+              <w:right w:val="single" w:sz="4" w:space="0" w:color="D0CEC6"/>
+              <w:insideH w:val="single" w:sz="4" w:space="0" w:color="D0CEC6"/>
+              <w:insideV w:val="single" w:sz="4" w:space="0" w:color="D0CEC6"/>
+            </w:tcBorders>
+          </w:tcPr>
+          <w:p>
+            <w:r>
+              <w:rPr>
+                <w:rFonts w:ascii="Arial" w:hAnsi="Arial"/>
+                <w:color w:val="1C1C1A"/>
+                <w:sz w:val="22"/>
+              </w:rPr>
+              <w:t>Fewer than 1 in 4 businesses respond within the timeframe that has the highest conversion rate.</w:t>
+            </w:r>
+          </w:p>
+        </w:tc>
+      </w:tr>
+      <w:tr>
+        <w:tc>
+          <w:tcPr>
+            <w:tcW w:type="dxa" w:w="2520"/>
+            <w:tcMar>
+              <w:top w:w="80" w:type="dxa"/>
+              <w:bottom w:w="80" w:type="dxa"/>
+              <w:left w:w="115" w:type="dxa"/>
+              <w:right w:w="115" w:type="dxa"/>
+            </w:tcMar>
+            <w:tcBorders>
+              <w:top w:val="single" w:sz="4" w:space="0" w:color="D0CEC6"/>
+              <w:left w:val="single" w:sz="4" w:space="0" w:color="D0CEC6"/>
+              <w:bottom w:val="single" w:sz="4" w:space="0" w:color="D0CEC6"/>
+              <w:right w:val="single" w:sz="4" w:space="0" w:color="D0CEC6"/>
+              <w:insideH w:val="single" w:sz="4" w:space="0" w:color="D0CEC6"/>
+              <w:insideV w:val="single" w:sz="4" w:space="0" w:color="D0CEC6"/>
+            </w:tcBorders>
+          </w:tcPr>
+          <w:p>
+            <w:r>
+              <w:rPr>
+                <w:rFonts w:ascii="Arial" w:hAnsi="Arial"/>
+                <w:b/>
+                <w:color w:val="1A3A2A"/>
+                <w:sz w:val="22"/>
+              </w:rPr>
+              <w:t>62% of home service businesses have no web lead capture system at all</w:t>
+            </w:r>
+          </w:p>
+        </w:tc>
+        <w:tc>
+          <w:tcPr>
+            <w:tcW w:type="dxa" w:w="6480"/>
+            <w:tcMar>
+              <w:top w:w="80" w:type="dxa"/>
+              <w:bottom w:w="80" w:type="dxa"/>
+              <w:left w:w="115" w:type="dxa"/>
+              <w:right w:w="115" w:type="dxa"/>
+            </w:tcMar>
+            <w:tcBorders>
+              <w:top w:val="single" w:sz="4" w:space="0" w:color="D0CEC6"/>
+              <w:left w:val="single" w:sz="4" w:space="0" w:color="D0CEC6"/>
+              <w:bottom w:val="single" w:sz="4" w:space="0" w:color="D0CEC6"/>
+              <w:right w:val="single" w:sz="4" w:space="0" w:color="D0CEC6"/>
+              <w:insideH w:val="single" w:sz="4" w:space="0" w:color="D0CEC6"/>
+              <w:insideV w:val="single" w:sz="4" w:space="0" w:color="D0CEC6"/>
+            </w:tcBorders>
+          </w:tcPr>
+          <w:p>
+            <w:r>
+              <w:rPr>
+                <w:rFonts w:ascii="Arial" w:hAnsi="Arial"/>
+                <w:color w:val="1C1C1A"/>
+                <w:sz w:val="22"/>
+              </w:rPr>
+              <w:t>The majority of competitors are not capturing web leads in any systematic way. They are relying on calls, referrals, or manual follow-up.</w:t>
+            </w:r>
+          </w:p>
+        </w:tc>
+      </w:tr>
+    </w:tbl>
+    <w:p/>
+    <w:p>
+      <w:pPr>
+        <w:jc w:val="left"/>
+        <w:spacing w:before="300" w:after="160"/>
+        <w:pBdr>
+          <w:bottom w:val="single" w:sz="4" w:space="4" w:color="e2e0d8"/>
+        </w:pBdr>
+      </w:pPr>
+      <w:r>
+        <w:rPr>
+          <w:rFonts w:ascii="Arial" w:hAnsi="Arial"/>
+          <w:b/>
+          <w:color w:val="1A3A2A"/>
+          <w:sz w:val="28"/>
+        </w:rPr>
+        <w:t>What This Means in Practice</w:t>
+      </w:r>
+    </w:p>
+    <w:p>
+      <w:pPr>
+        <w:spacing w:before="0" w:after="120"/>
+      </w:pPr>
+      <w:r>
+        <w:rPr>
+          <w:rFonts w:ascii="Arial" w:hAnsi="Arial"/>
+          <w:color w:val="1C1C1A"/>
+          <w:sz w:val="22"/>
+        </w:rPr>
+        <w:t>The market is set up to reward the business that is simply aware and available when a lead comes in. It is less about being the cheapest or having the most reviews — and more about being the one that shows up in the customer's inbox or voicemail before anyone else does.</w:t>
+      </w:r>
+    </w:p>
+    <w:p>
+      <w:pPr>
+        <w:spacing w:before="0" w:after="120"/>
+      </w:pPr>
+      <w:r>
+        <w:rPr>
+          <w:rFonts w:ascii="Arial" w:hAnsi="Arial"/>
+          <w:color w:val="1C1C1A"/>
+          <w:sz w:val="22"/>
+        </w:rPr>
+        <w:t>Our system is designed around this reality. The instant email and text notification exists specifically because the research shows that the time between a lead submitting a form and a business responding is where most revenue is lost. You receive the lead the moment it is submitted — the rest is in your hands.</w:t>
+      </w:r>
+    </w:p>
+    <w:p>
+      <w:pPr>
+        <w:spacing w:before="0" w:after="120"/>
+      </w:pPr>
+      <w:r>
+        <w:rPr>
+          <w:rFonts w:ascii="Arial" w:hAnsi="Arial"/>
+          <w:color w:val="1C1C1A"/>
+          <w:sz w:val="22"/>
+        </w:rPr>
+        <w:t>For a deeper breakdown of the data, see the Speed-to-Lead Facts Sheet included with your subscription.</w:t>
       </w:r>
     </w:p>
     <w:p>
@@ -2069,7 +2499,7 @@
         </w:tc>
         <w:tc>
           <w:tcPr>
-            <w:tcW w:type="dxa" w:w="1584"/>
+            <w:tcW w:type="dxa" w:w="1512"/>
             <w:tcMar>
               <w:top w:w="60" w:type="dxa"/>
               <w:bottom w:w="60" w:type="dxa"/>
@@ -2100,7 +2530,7 @@
         </w:tc>
         <w:tc>
           <w:tcPr>
-            <w:tcW w:type="dxa" w:w="1584"/>
+            <w:tcW w:type="dxa" w:w="1512"/>
             <w:tcMar>
               <w:top w:w="60" w:type="dxa"/>
               <w:bottom w:w="60" w:type="dxa"/>
@@ -2131,7 +2561,7 @@
         </w:tc>
         <w:tc>
           <w:tcPr>
-            <w:tcW w:type="dxa" w:w="1440"/>
+            <w:tcW w:type="dxa" w:w="1368"/>
             <w:tcMar>
               <w:top w:w="60" w:type="dxa"/>
               <w:bottom w:w="60" w:type="dxa"/>
@@ -2162,7 +2592,7 @@
         </w:tc>
         <w:tc>
           <w:tcPr>
-            <w:tcW w:type="dxa" w:w="1440"/>
+            <w:tcW w:type="dxa" w:w="1368"/>
             <w:tcMar>
               <w:top w:w="60" w:type="dxa"/>
               <w:bottom w:w="60" w:type="dxa"/>
@@ -2256,7 +2686,7 @@
         </w:tc>
         <w:tc>
           <w:tcPr>
-            <w:tcW w:type="dxa" w:w="1584"/>
+            <w:tcW w:type="dxa" w:w="1512"/>
             <w:tcMar>
               <w:top w:w="60" w:type="dxa"/>
               <w:bottom w:w="60" w:type="dxa"/>
@@ -2285,7 +2715,7 @@
         </w:tc>
         <w:tc>
           <w:tcPr>
-            <w:tcW w:type="dxa" w:w="1584"/>
+            <w:tcW w:type="dxa" w:w="1512"/>
             <w:tcMar>
               <w:top w:w="60" w:type="dxa"/>
               <w:bottom w:w="60" w:type="dxa"/>
@@ -2314,7 +2744,7 @@
         </w:tc>
         <w:tc>
           <w:tcPr>
-            <w:tcW w:type="dxa" w:w="1440"/>
+            <w:tcW w:type="dxa" w:w="1368"/>
             <w:tcMar>
               <w:top w:w="60" w:type="dxa"/>
               <w:bottom w:w="60" w:type="dxa"/>
@@ -2343,7 +2773,7 @@
         </w:tc>
         <w:tc>
           <w:tcPr>
-            <w:tcW w:type="dxa" w:w="1440"/>
+            <w:tcW w:type="dxa" w:w="1368"/>
             <w:tcMar>
               <w:top w:w="60" w:type="dxa"/>
               <w:bottom w:w="60" w:type="dxa"/>
@@ -2433,7 +2863,7 @@
         </w:tc>
         <w:tc>
           <w:tcPr>
-            <w:tcW w:type="dxa" w:w="1584"/>
+            <w:tcW w:type="dxa" w:w="1512"/>
             <w:tcMar>
               <w:top w:w="60" w:type="dxa"/>
               <w:bottom w:w="60" w:type="dxa"/>
@@ -2462,7 +2892,7 @@
         </w:tc>
         <w:tc>
           <w:tcPr>
-            <w:tcW w:type="dxa" w:w="1584"/>
+            <w:tcW w:type="dxa" w:w="1512"/>
             <w:tcMar>
               <w:top w:w="60" w:type="dxa"/>
               <w:bottom w:w="60" w:type="dxa"/>
@@ -2491,7 +2921,7 @@
         </w:tc>
         <w:tc>
           <w:tcPr>
-            <w:tcW w:type="dxa" w:w="1440"/>
+            <w:tcW w:type="dxa" w:w="1368"/>
             <w:tcMar>
               <w:top w:w="60" w:type="dxa"/>
               <w:bottom w:w="60" w:type="dxa"/>
@@ -2520,7 +2950,7 @@
         </w:tc>
         <w:tc>
           <w:tcPr>
-            <w:tcW w:type="dxa" w:w="1440"/>
+            <w:tcW w:type="dxa" w:w="1368"/>
             <w:tcMar>
               <w:top w:w="60" w:type="dxa"/>
               <w:bottom w:w="60" w:type="dxa"/>
@@ -2610,7 +3040,7 @@
         </w:tc>
         <w:tc>
           <w:tcPr>
-            <w:tcW w:type="dxa" w:w="1584"/>
+            <w:tcW w:type="dxa" w:w="1512"/>
             <w:tcMar>
               <w:top w:w="60" w:type="dxa"/>
               <w:bottom w:w="60" w:type="dxa"/>
@@ -2639,7 +3069,7 @@
         </w:tc>
         <w:tc>
           <w:tcPr>
-            <w:tcW w:type="dxa" w:w="1584"/>
+            <w:tcW w:type="dxa" w:w="1512"/>
             <w:tcMar>
               <w:top w:w="60" w:type="dxa"/>
               <w:bottom w:w="60" w:type="dxa"/>
@@ -2668,7 +3098,7 @@
         </w:tc>
         <w:tc>
           <w:tcPr>
-            <w:tcW w:type="dxa" w:w="1440"/>
+            <w:tcW w:type="dxa" w:w="1368"/>
             <w:tcMar>
               <w:top w:w="60" w:type="dxa"/>
               <w:bottom w:w="60" w:type="dxa"/>
@@ -2697,7 +3127,7 @@
         </w:tc>
         <w:tc>
           <w:tcPr>
-            <w:tcW w:type="dxa" w:w="1440"/>
+            <w:tcW w:type="dxa" w:w="1368"/>
             <w:tcMar>
               <w:top w:w="60" w:type="dxa"/>
               <w:bottom w:w="60" w:type="dxa"/>
@@ -2787,7 +3217,7 @@
         </w:tc>
         <w:tc>
           <w:tcPr>
-            <w:tcW w:type="dxa" w:w="1584"/>
+            <w:tcW w:type="dxa" w:w="1512"/>
             <w:tcMar>
               <w:top w:w="60" w:type="dxa"/>
               <w:bottom w:w="60" w:type="dxa"/>
@@ -2816,7 +3246,7 @@
         </w:tc>
         <w:tc>
           <w:tcPr>
-            <w:tcW w:type="dxa" w:w="1584"/>
+            <w:tcW w:type="dxa" w:w="1512"/>
             <w:tcMar>
               <w:top w:w="60" w:type="dxa"/>
               <w:bottom w:w="60" w:type="dxa"/>
@@ -2845,7 +3275,7 @@
         </w:tc>
         <w:tc>
           <w:tcPr>
-            <w:tcW w:type="dxa" w:w="1440"/>
+            <w:tcW w:type="dxa" w:w="1368"/>
             <w:tcMar>
               <w:top w:w="60" w:type="dxa"/>
               <w:bottom w:w="60" w:type="dxa"/>
@@ -2874,7 +3304,7 @@
         </w:tc>
         <w:tc>
           <w:tcPr>
-            <w:tcW w:type="dxa" w:w="1440"/>
+            <w:tcW w:type="dxa" w:w="1368"/>
             <w:tcMar>
               <w:top w:w="60" w:type="dxa"/>
               <w:bottom w:w="60" w:type="dxa"/>
@@ -2964,7 +3394,7 @@
         </w:tc>
         <w:tc>
           <w:tcPr>
-            <w:tcW w:type="dxa" w:w="1584"/>
+            <w:tcW w:type="dxa" w:w="1512"/>
             <w:tcMar>
               <w:top w:w="60" w:type="dxa"/>
               <w:bottom w:w="60" w:type="dxa"/>
@@ -2993,7 +3423,7 @@
         </w:tc>
         <w:tc>
           <w:tcPr>
-            <w:tcW w:type="dxa" w:w="1584"/>
+            <w:tcW w:type="dxa" w:w="1512"/>
             <w:tcMar>
               <w:top w:w="60" w:type="dxa"/>
               <w:bottom w:w="60" w:type="dxa"/>
@@ -3022,7 +3452,7 @@
         </w:tc>
         <w:tc>
           <w:tcPr>
-            <w:tcW w:type="dxa" w:w="1440"/>
+            <w:tcW w:type="dxa" w:w="1368"/>
             <w:tcMar>
               <w:top w:w="60" w:type="dxa"/>
               <w:bottom w:w="60" w:type="dxa"/>
@@ -3051,7 +3481,7 @@
         </w:tc>
         <w:tc>
           <w:tcPr>
-            <w:tcW w:type="dxa" w:w="1440"/>
+            <w:tcW w:type="dxa" w:w="1368"/>
             <w:tcMar>
               <w:top w:w="60" w:type="dxa"/>
               <w:bottom w:w="60" w:type="dxa"/>
@@ -3141,7 +3571,7 @@
         </w:tc>
         <w:tc>
           <w:tcPr>
-            <w:tcW w:type="dxa" w:w="1584"/>
+            <w:tcW w:type="dxa" w:w="1512"/>
             <w:tcMar>
               <w:top w:w="60" w:type="dxa"/>
               <w:bottom w:w="60" w:type="dxa"/>
@@ -3170,7 +3600,7 @@
         </w:tc>
         <w:tc>
           <w:tcPr>
-            <w:tcW w:type="dxa" w:w="1584"/>
+            <w:tcW w:type="dxa" w:w="1512"/>
             <w:tcMar>
               <w:top w:w="60" w:type="dxa"/>
               <w:bottom w:w="60" w:type="dxa"/>
@@ -3199,7 +3629,7 @@
         </w:tc>
         <w:tc>
           <w:tcPr>
-            <w:tcW w:type="dxa" w:w="1440"/>
+            <w:tcW w:type="dxa" w:w="1368"/>
             <w:tcMar>
               <w:top w:w="60" w:type="dxa"/>
               <w:bottom w:w="60" w:type="dxa"/>
@@ -3228,7 +3658,7 @@
         </w:tc>
         <w:tc>
           <w:tcPr>
-            <w:tcW w:type="dxa" w:w="1440"/>
+            <w:tcW w:type="dxa" w:w="1368"/>
             <w:tcMar>
               <w:top w:w="60" w:type="dxa"/>
               <w:bottom w:w="60" w:type="dxa"/>
@@ -3318,7 +3748,7 @@
         </w:tc>
         <w:tc>
           <w:tcPr>
-            <w:tcW w:type="dxa" w:w="1584"/>
+            <w:tcW w:type="dxa" w:w="1512"/>
             <w:tcMar>
               <w:top w:w="60" w:type="dxa"/>
               <w:bottom w:w="60" w:type="dxa"/>
@@ -3347,7 +3777,7 @@
         </w:tc>
         <w:tc>
           <w:tcPr>
-            <w:tcW w:type="dxa" w:w="1584"/>
+            <w:tcW w:type="dxa" w:w="1512"/>
             <w:tcMar>
               <w:top w:w="60" w:type="dxa"/>
               <w:bottom w:w="60" w:type="dxa"/>
@@ -3376,7 +3806,7 @@
         </w:tc>
         <w:tc>
           <w:tcPr>
-            <w:tcW w:type="dxa" w:w="1440"/>
+            <w:tcW w:type="dxa" w:w="1368"/>
             <w:tcMar>
               <w:top w:w="60" w:type="dxa"/>
               <w:bottom w:w="60" w:type="dxa"/>
@@ -3405,7 +3835,7 @@
         </w:tc>
         <w:tc>
           <w:tcPr>
-            <w:tcW w:type="dxa" w:w="1440"/>
+            <w:tcW w:type="dxa" w:w="1368"/>
             <w:tcMar>
               <w:top w:w="60" w:type="dxa"/>
               <w:bottom w:w="60" w:type="dxa"/>
@@ -3489,7 +3919,123 @@
                 <w:color w:val="1A3A2A"/>
                 <w:sz w:val="20"/>
               </w:rPr>
-              <w:t>Learning curve</w:t>
+              <w:t>GBP audit (quarterly)</w:t>
+            </w:r>
+          </w:p>
+        </w:tc>
+        <w:tc>
+          <w:tcPr>
+            <w:tcW w:type="dxa" w:w="1512"/>
+            <w:tcMar>
+              <w:top w:w="60" w:type="dxa"/>
+              <w:bottom w:w="60" w:type="dxa"/>
+              <w:left w:w="80" w:type="dxa"/>
+              <w:right w:w="80" w:type="dxa"/>
+            </w:tcMar>
+            <w:tcBorders>
+              <w:top w:val="single" w:sz="4" w:space="0" w:color="D0CEC6"/>
+              <w:left w:val="single" w:sz="4" w:space="0" w:color="D0CEC6"/>
+              <w:bottom w:val="single" w:sz="4" w:space="0" w:color="D0CEC6"/>
+              <w:right w:val="single" w:sz="4" w:space="0" w:color="D0CEC6"/>
+              <w:insideH w:val="single" w:sz="4" w:space="0" w:color="D0CEC6"/>
+              <w:insideV w:val="single" w:sz="4" w:space="0" w:color="D0CEC6"/>
+            </w:tcBorders>
+          </w:tcPr>
+          <w:p>
+            <w:r>
+              <w:rPr>
+                <w:rFonts w:ascii="Arial" w:hAnsi="Arial"/>
+                <w:color w:val="1C1C1A"/>
+                <w:sz w:val="20"/>
+              </w:rPr>
+              <w:t>Yes — we do it</w:t>
+            </w:r>
+          </w:p>
+        </w:tc>
+        <w:tc>
+          <w:tcPr>
+            <w:tcW w:type="dxa" w:w="1512"/>
+            <w:tcMar>
+              <w:top w:w="60" w:type="dxa"/>
+              <w:bottom w:w="60" w:type="dxa"/>
+              <w:left w:w="80" w:type="dxa"/>
+              <w:right w:w="80" w:type="dxa"/>
+            </w:tcMar>
+            <w:tcBorders>
+              <w:top w:val="single" w:sz="4" w:space="0" w:color="D0CEC6"/>
+              <w:left w:val="single" w:sz="4" w:space="0" w:color="D0CEC6"/>
+              <w:bottom w:val="single" w:sz="4" w:space="0" w:color="D0CEC6"/>
+              <w:right w:val="single" w:sz="4" w:space="0" w:color="D0CEC6"/>
+              <w:insideH w:val="single" w:sz="4" w:space="0" w:color="D0CEC6"/>
+              <w:insideV w:val="single" w:sz="4" w:space="0" w:color="D0CEC6"/>
+            </w:tcBorders>
+          </w:tcPr>
+          <w:p>
+            <w:r>
+              <w:rPr>
+                <w:rFonts w:ascii="Arial" w:hAnsi="Arial"/>
+                <w:color w:val="1C1C1A"/>
+                <w:sz w:val="20"/>
+              </w:rPr>
+              <w:t>No</w:t>
+            </w:r>
+          </w:p>
+        </w:tc>
+        <w:tc>
+          <w:tcPr>
+            <w:tcW w:type="dxa" w:w="1368"/>
+            <w:tcMar>
+              <w:top w:w="60" w:type="dxa"/>
+              <w:bottom w:w="60" w:type="dxa"/>
+              <w:left w:w="80" w:type="dxa"/>
+              <w:right w:w="80" w:type="dxa"/>
+            </w:tcMar>
+            <w:tcBorders>
+              <w:top w:val="single" w:sz="4" w:space="0" w:color="D0CEC6"/>
+              <w:left w:val="single" w:sz="4" w:space="0" w:color="D0CEC6"/>
+              <w:bottom w:val="single" w:sz="4" w:space="0" w:color="D0CEC6"/>
+              <w:right w:val="single" w:sz="4" w:space="0" w:color="D0CEC6"/>
+              <w:insideH w:val="single" w:sz="4" w:space="0" w:color="D0CEC6"/>
+              <w:insideV w:val="single" w:sz="4" w:space="0" w:color="D0CEC6"/>
+            </w:tcBorders>
+          </w:tcPr>
+          <w:p>
+            <w:r>
+              <w:rPr>
+                <w:rFonts w:ascii="Arial" w:hAnsi="Arial"/>
+                <w:color w:val="1C1C1A"/>
+                <w:sz w:val="20"/>
+              </w:rPr>
+              <w:t>No</w:t>
+            </w:r>
+          </w:p>
+        </w:tc>
+        <w:tc>
+          <w:tcPr>
+            <w:tcW w:type="dxa" w:w="1368"/>
+            <w:tcMar>
+              <w:top w:w="60" w:type="dxa"/>
+              <w:bottom w:w="60" w:type="dxa"/>
+              <w:left w:w="80" w:type="dxa"/>
+              <w:right w:w="80" w:type="dxa"/>
+            </w:tcMar>
+            <w:tcBorders>
+              <w:top w:val="single" w:sz="4" w:space="0" w:color="D0CEC6"/>
+              <w:left w:val="single" w:sz="4" w:space="0" w:color="D0CEC6"/>
+              <w:bottom w:val="single" w:sz="4" w:space="0" w:color="D0CEC6"/>
+              <w:right w:val="single" w:sz="4" w:space="0" w:color="D0CEC6"/>
+              <w:insideH w:val="single" w:sz="4" w:space="0" w:color="D0CEC6"/>
+              <w:insideV w:val="single" w:sz="4" w:space="0" w:color="D0CEC6"/>
+            </w:tcBorders>
+          </w:tcPr>
+          <w:p>
+            <w:r>
+              <w:rPr>
+                <w:rFonts w:ascii="Arial" w:hAnsi="Arial"/>
+                <w:color w:val="1C1C1A"/>
+                <w:sz w:val="20"/>
+              </w:rPr>
+              <w:t>No</w:t>
             </w:r>
           </w:p>
         </w:tc>
@@ -3518,7 +4064,155 @@
                 <w:color w:val="1C1C1A"/>
                 <w:sz w:val="20"/>
               </w:rPr>
-              <w:t>None</w:t>
+              <w:t>No</w:t>
+            </w:r>
+          </w:p>
+        </w:tc>
+      </w:tr>
+      <w:tr>
+        <w:tc>
+          <w:tcPr>
+            <w:tcW w:type="dxa" w:w="2160"/>
+            <w:tcMar>
+              <w:top w:w="60" w:type="dxa"/>
+              <w:bottom w:w="60" w:type="dxa"/>
+              <w:left w:w="80" w:type="dxa"/>
+              <w:right w:w="80" w:type="dxa"/>
+            </w:tcMar>
+            <w:tcBorders>
+              <w:top w:val="single" w:sz="4" w:space="0" w:color="D0CEC6"/>
+              <w:left w:val="single" w:sz="4" w:space="0" w:color="D0CEC6"/>
+              <w:bottom w:val="single" w:sz="4" w:space="0" w:color="D0CEC6"/>
+              <w:right w:val="single" w:sz="4" w:space="0" w:color="D0CEC6"/>
+              <w:insideH w:val="single" w:sz="4" w:space="0" w:color="D0CEC6"/>
+              <w:insideV w:val="single" w:sz="4" w:space="0" w:color="D0CEC6"/>
+            </w:tcBorders>
+          </w:tcPr>
+          <w:p>
+            <w:r>
+              <w:rPr>
+                <w:rFonts w:ascii="Arial" w:hAnsi="Arial"/>
+                <w:b/>
+                <w:color w:val="1A3A2A"/>
+                <w:sz w:val="20"/>
+              </w:rPr>
+              <w:t>Speed-to-lead intel</w:t>
+            </w:r>
+          </w:p>
+        </w:tc>
+        <w:tc>
+          <w:tcPr>
+            <w:tcW w:type="dxa" w:w="1512"/>
+            <w:tcMar>
+              <w:top w:w="60" w:type="dxa"/>
+              <w:bottom w:w="60" w:type="dxa"/>
+              <w:left w:w="80" w:type="dxa"/>
+              <w:right w:w="80" w:type="dxa"/>
+            </w:tcMar>
+            <w:tcBorders>
+              <w:top w:val="single" w:sz="4" w:space="0" w:color="D0CEC6"/>
+              <w:left w:val="single" w:sz="4" w:space="0" w:color="D0CEC6"/>
+              <w:bottom w:val="single" w:sz="4" w:space="0" w:color="D0CEC6"/>
+              <w:right w:val="single" w:sz="4" w:space="0" w:color="D0CEC6"/>
+              <w:insideH w:val="single" w:sz="4" w:space="0" w:color="D0CEC6"/>
+              <w:insideV w:val="single" w:sz="4" w:space="0" w:color="D0CEC6"/>
+            </w:tcBorders>
+          </w:tcPr>
+          <w:p>
+            <w:r>
+              <w:rPr>
+                <w:rFonts w:ascii="Arial" w:hAnsi="Arial"/>
+                <w:color w:val="1C1C1A"/>
+                <w:sz w:val="20"/>
+              </w:rPr>
+              <w:t>Yes — included</w:t>
+            </w:r>
+          </w:p>
+        </w:tc>
+        <w:tc>
+          <w:tcPr>
+            <w:tcW w:type="dxa" w:w="1512"/>
+            <w:tcMar>
+              <w:top w:w="60" w:type="dxa"/>
+              <w:bottom w:w="60" w:type="dxa"/>
+              <w:left w:w="80" w:type="dxa"/>
+              <w:right w:w="80" w:type="dxa"/>
+            </w:tcMar>
+            <w:tcBorders>
+              <w:top w:val="single" w:sz="4" w:space="0" w:color="D0CEC6"/>
+              <w:left w:val="single" w:sz="4" w:space="0" w:color="D0CEC6"/>
+              <w:bottom w:val="single" w:sz="4" w:space="0" w:color="D0CEC6"/>
+              <w:right w:val="single" w:sz="4" w:space="0" w:color="D0CEC6"/>
+              <w:insideH w:val="single" w:sz="4" w:space="0" w:color="D0CEC6"/>
+              <w:insideV w:val="single" w:sz="4" w:space="0" w:color="D0CEC6"/>
+            </w:tcBorders>
+          </w:tcPr>
+          <w:p>
+            <w:r>
+              <w:rPr>
+                <w:rFonts w:ascii="Arial" w:hAnsi="Arial"/>
+                <w:color w:val="1C1C1A"/>
+                <w:sz w:val="20"/>
+              </w:rPr>
+              <w:t>No</w:t>
+            </w:r>
+          </w:p>
+        </w:tc>
+        <w:tc>
+          <w:tcPr>
+            <w:tcW w:type="dxa" w:w="1368"/>
+            <w:tcMar>
+              <w:top w:w="60" w:type="dxa"/>
+              <w:bottom w:w="60" w:type="dxa"/>
+              <w:left w:w="80" w:type="dxa"/>
+              <w:right w:w="80" w:type="dxa"/>
+            </w:tcMar>
+            <w:tcBorders>
+              <w:top w:val="single" w:sz="4" w:space="0" w:color="D0CEC6"/>
+              <w:left w:val="single" w:sz="4" w:space="0" w:color="D0CEC6"/>
+              <w:bottom w:val="single" w:sz="4" w:space="0" w:color="D0CEC6"/>
+              <w:right w:val="single" w:sz="4" w:space="0" w:color="D0CEC6"/>
+              <w:insideH w:val="single" w:sz="4" w:space="0" w:color="D0CEC6"/>
+              <w:insideV w:val="single" w:sz="4" w:space="0" w:color="D0CEC6"/>
+            </w:tcBorders>
+          </w:tcPr>
+          <w:p>
+            <w:r>
+              <w:rPr>
+                <w:rFonts w:ascii="Arial" w:hAnsi="Arial"/>
+                <w:color w:val="1C1C1A"/>
+                <w:sz w:val="20"/>
+              </w:rPr>
+              <w:t>No</w:t>
+            </w:r>
+          </w:p>
+        </w:tc>
+        <w:tc>
+          <w:tcPr>
+            <w:tcW w:type="dxa" w:w="1368"/>
+            <w:tcMar>
+              <w:top w:w="60" w:type="dxa"/>
+              <w:bottom w:w="60" w:type="dxa"/>
+              <w:left w:w="80" w:type="dxa"/>
+              <w:right w:w="80" w:type="dxa"/>
+            </w:tcMar>
+            <w:tcBorders>
+              <w:top w:val="single" w:sz="4" w:space="0" w:color="D0CEC6"/>
+              <w:left w:val="single" w:sz="4" w:space="0" w:color="D0CEC6"/>
+              <w:bottom w:val="single" w:sz="4" w:space="0" w:color="D0CEC6"/>
+              <w:right w:val="single" w:sz="4" w:space="0" w:color="D0CEC6"/>
+              <w:insideH w:val="single" w:sz="4" w:space="0" w:color="D0CEC6"/>
+              <w:insideV w:val="single" w:sz="4" w:space="0" w:color="D0CEC6"/>
+            </w:tcBorders>
+          </w:tcPr>
+          <w:p>
+            <w:r>
+              <w:rPr>
+                <w:rFonts w:ascii="Arial" w:hAnsi="Arial"/>
+                <w:color w:val="1C1C1A"/>
+                <w:sz w:val="20"/>
+              </w:rPr>
+              <w:t>No</w:t>
             </w:r>
           </w:p>
         </w:tc>
@@ -3547,13 +4241,280 @@
                 <w:color w:val="1C1C1A"/>
                 <w:sz w:val="20"/>
               </w:rPr>
+              <w:t>No</w:t>
+            </w:r>
+          </w:p>
+        </w:tc>
+      </w:tr>
+      <w:tr>
+        <w:tc>
+          <w:tcPr>
+            <w:tcW w:type="dxa" w:w="2160"/>
+            <w:tcMar>
+              <w:top w:w="60" w:type="dxa"/>
+              <w:bottom w:w="60" w:type="dxa"/>
+              <w:left w:w="80" w:type="dxa"/>
+              <w:right w:w="80" w:type="dxa"/>
+            </w:tcMar>
+            <w:tcBorders>
+              <w:top w:val="single" w:sz="4" w:space="0" w:color="D0CEC6"/>
+              <w:left w:val="single" w:sz="4" w:space="0" w:color="D0CEC6"/>
+              <w:bottom w:val="single" w:sz="4" w:space="0" w:color="D0CEC6"/>
+              <w:right w:val="single" w:sz="4" w:space="0" w:color="D0CEC6"/>
+              <w:insideH w:val="single" w:sz="4" w:space="0" w:color="D0CEC6"/>
+              <w:insideV w:val="single" w:sz="4" w:space="0" w:color="D0CEC6"/>
+            </w:tcBorders>
+          </w:tcPr>
+          <w:p>
+            <w:r>
+              <w:rPr>
+                <w:rFonts w:ascii="Arial" w:hAnsi="Arial"/>
+                <w:b/>
+                <w:color w:val="1A3A2A"/>
+                <w:sz w:val="20"/>
+              </w:rPr>
+              <w:t>Form updates included</w:t>
+            </w:r>
+          </w:p>
+        </w:tc>
+        <w:tc>
+          <w:tcPr>
+            <w:tcW w:type="dxa" w:w="1512"/>
+            <w:tcMar>
+              <w:top w:w="60" w:type="dxa"/>
+              <w:bottom w:w="60" w:type="dxa"/>
+              <w:left w:w="80" w:type="dxa"/>
+              <w:right w:w="80" w:type="dxa"/>
+            </w:tcMar>
+            <w:tcBorders>
+              <w:top w:val="single" w:sz="4" w:space="0" w:color="D0CEC6"/>
+              <w:left w:val="single" w:sz="4" w:space="0" w:color="D0CEC6"/>
+              <w:bottom w:val="single" w:sz="4" w:space="0" w:color="D0CEC6"/>
+              <w:right w:val="single" w:sz="4" w:space="0" w:color="D0CEC6"/>
+              <w:insideH w:val="single" w:sz="4" w:space="0" w:color="D0CEC6"/>
+              <w:insideV w:val="single" w:sz="4" w:space="0" w:color="D0CEC6"/>
+            </w:tcBorders>
+          </w:tcPr>
+          <w:p>
+            <w:r>
+              <w:rPr>
+                <w:rFonts w:ascii="Arial" w:hAnsi="Arial"/>
+                <w:color w:val="1C1C1A"/>
+                <w:sz w:val="20"/>
+              </w:rPr>
+              <w:t>Yes — always</w:t>
+            </w:r>
+          </w:p>
+        </w:tc>
+        <w:tc>
+          <w:tcPr>
+            <w:tcW w:type="dxa" w:w="1512"/>
+            <w:tcMar>
+              <w:top w:w="60" w:type="dxa"/>
+              <w:bottom w:w="60" w:type="dxa"/>
+              <w:left w:w="80" w:type="dxa"/>
+              <w:right w:w="80" w:type="dxa"/>
+            </w:tcMar>
+            <w:tcBorders>
+              <w:top w:val="single" w:sz="4" w:space="0" w:color="D0CEC6"/>
+              <w:left w:val="single" w:sz="4" w:space="0" w:color="D0CEC6"/>
+              <w:bottom w:val="single" w:sz="4" w:space="0" w:color="D0CEC6"/>
+              <w:right w:val="single" w:sz="4" w:space="0" w:color="D0CEC6"/>
+              <w:insideH w:val="single" w:sz="4" w:space="0" w:color="D0CEC6"/>
+              <w:insideV w:val="single" w:sz="4" w:space="0" w:color="D0CEC6"/>
+            </w:tcBorders>
+          </w:tcPr>
+          <w:p>
+            <w:r>
+              <w:rPr>
+                <w:rFonts w:ascii="Arial" w:hAnsi="Arial"/>
+                <w:color w:val="1C1C1A"/>
+                <w:sz w:val="20"/>
+              </w:rPr>
+              <w:t>You do it</w:t>
+            </w:r>
+          </w:p>
+        </w:tc>
+        <w:tc>
+          <w:tcPr>
+            <w:tcW w:type="dxa" w:w="1368"/>
+            <w:tcMar>
+              <w:top w:w="60" w:type="dxa"/>
+              <w:bottom w:w="60" w:type="dxa"/>
+              <w:left w:w="80" w:type="dxa"/>
+              <w:right w:w="80" w:type="dxa"/>
+            </w:tcMar>
+            <w:tcBorders>
+              <w:top w:val="single" w:sz="4" w:space="0" w:color="D0CEC6"/>
+              <w:left w:val="single" w:sz="4" w:space="0" w:color="D0CEC6"/>
+              <w:bottom w:val="single" w:sz="4" w:space="0" w:color="D0CEC6"/>
+              <w:right w:val="single" w:sz="4" w:space="0" w:color="D0CEC6"/>
+              <w:insideH w:val="single" w:sz="4" w:space="0" w:color="D0CEC6"/>
+              <w:insideV w:val="single" w:sz="4" w:space="0" w:color="D0CEC6"/>
+            </w:tcBorders>
+          </w:tcPr>
+          <w:p>
+            <w:r>
+              <w:rPr>
+                <w:rFonts w:ascii="Arial" w:hAnsi="Arial"/>
+                <w:color w:val="1C1C1A"/>
+                <w:sz w:val="20"/>
+              </w:rPr>
+              <w:t>You do it</w:t>
+            </w:r>
+          </w:p>
+        </w:tc>
+        <w:tc>
+          <w:tcPr>
+            <w:tcW w:type="dxa" w:w="1368"/>
+            <w:tcMar>
+              <w:top w:w="60" w:type="dxa"/>
+              <w:bottom w:w="60" w:type="dxa"/>
+              <w:left w:w="80" w:type="dxa"/>
+              <w:right w:w="80" w:type="dxa"/>
+            </w:tcMar>
+            <w:tcBorders>
+              <w:top w:val="single" w:sz="4" w:space="0" w:color="D0CEC6"/>
+              <w:left w:val="single" w:sz="4" w:space="0" w:color="D0CEC6"/>
+              <w:bottom w:val="single" w:sz="4" w:space="0" w:color="D0CEC6"/>
+              <w:right w:val="single" w:sz="4" w:space="0" w:color="D0CEC6"/>
+              <w:insideH w:val="single" w:sz="4" w:space="0" w:color="D0CEC6"/>
+              <w:insideV w:val="single" w:sz="4" w:space="0" w:color="D0CEC6"/>
+            </w:tcBorders>
+          </w:tcPr>
+          <w:p>
+            <w:r>
+              <w:rPr>
+                <w:rFonts w:ascii="Arial" w:hAnsi="Arial"/>
+                <w:color w:val="1C1C1A"/>
+                <w:sz w:val="20"/>
+              </w:rPr>
+              <w:t>You do it</w:t>
+            </w:r>
+          </w:p>
+        </w:tc>
+        <w:tc>
+          <w:tcPr>
+            <w:tcW w:type="dxa" w:w="1584"/>
+            <w:tcMar>
+              <w:top w:w="60" w:type="dxa"/>
+              <w:bottom w:w="60" w:type="dxa"/>
+              <w:left w:w="80" w:type="dxa"/>
+              <w:right w:w="80" w:type="dxa"/>
+            </w:tcMar>
+            <w:tcBorders>
+              <w:top w:val="single" w:sz="4" w:space="0" w:color="D0CEC6"/>
+              <w:left w:val="single" w:sz="4" w:space="0" w:color="D0CEC6"/>
+              <w:bottom w:val="single" w:sz="4" w:space="0" w:color="D0CEC6"/>
+              <w:right w:val="single" w:sz="4" w:space="0" w:color="D0CEC6"/>
+              <w:insideH w:val="single" w:sz="4" w:space="0" w:color="D0CEC6"/>
+              <w:insideV w:val="single" w:sz="4" w:space="0" w:color="D0CEC6"/>
+            </w:tcBorders>
+          </w:tcPr>
+          <w:p>
+            <w:r>
+              <w:rPr>
+                <w:rFonts w:ascii="Arial" w:hAnsi="Arial"/>
+                <w:color w:val="1C1C1A"/>
+                <w:sz w:val="20"/>
+              </w:rPr>
+              <w:t>N/A</w:t>
+            </w:r>
+          </w:p>
+        </w:tc>
+      </w:tr>
+      <w:tr>
+        <w:tc>
+          <w:tcPr>
+            <w:tcW w:type="dxa" w:w="2160"/>
+            <w:tcMar>
+              <w:top w:w="60" w:type="dxa"/>
+              <w:bottom w:w="60" w:type="dxa"/>
+              <w:left w:w="80" w:type="dxa"/>
+              <w:right w:w="80" w:type="dxa"/>
+            </w:tcMar>
+            <w:tcBorders>
+              <w:top w:val="single" w:sz="4" w:space="0" w:color="D0CEC6"/>
+              <w:left w:val="single" w:sz="4" w:space="0" w:color="D0CEC6"/>
+              <w:bottom w:val="single" w:sz="4" w:space="0" w:color="D0CEC6"/>
+              <w:right w:val="single" w:sz="4" w:space="0" w:color="D0CEC6"/>
+              <w:insideH w:val="single" w:sz="4" w:space="0" w:color="D0CEC6"/>
+              <w:insideV w:val="single" w:sz="4" w:space="0" w:color="D0CEC6"/>
+            </w:tcBorders>
+          </w:tcPr>
+          <w:p>
+            <w:r>
+              <w:rPr>
+                <w:rFonts w:ascii="Arial" w:hAnsi="Arial"/>
+                <w:b/>
+                <w:color w:val="1A3A2A"/>
+                <w:sz w:val="20"/>
+              </w:rPr>
+              <w:t>Learning curve</w:t>
+            </w:r>
+          </w:p>
+        </w:tc>
+        <w:tc>
+          <w:tcPr>
+            <w:tcW w:type="dxa" w:w="1512"/>
+            <w:tcMar>
+              <w:top w:w="60" w:type="dxa"/>
+              <w:bottom w:w="60" w:type="dxa"/>
+              <w:left w:w="80" w:type="dxa"/>
+              <w:right w:w="80" w:type="dxa"/>
+            </w:tcMar>
+            <w:tcBorders>
+              <w:top w:val="single" w:sz="4" w:space="0" w:color="D0CEC6"/>
+              <w:left w:val="single" w:sz="4" w:space="0" w:color="D0CEC6"/>
+              <w:bottom w:val="single" w:sz="4" w:space="0" w:color="D0CEC6"/>
+              <w:right w:val="single" w:sz="4" w:space="0" w:color="D0CEC6"/>
+              <w:insideH w:val="single" w:sz="4" w:space="0" w:color="D0CEC6"/>
+              <w:insideV w:val="single" w:sz="4" w:space="0" w:color="D0CEC6"/>
+            </w:tcBorders>
+          </w:tcPr>
+          <w:p>
+            <w:r>
+              <w:rPr>
+                <w:rFonts w:ascii="Arial" w:hAnsi="Arial"/>
+                <w:color w:val="1C1C1A"/>
+                <w:sz w:val="20"/>
+              </w:rPr>
+              <w:t>None</w:t>
+            </w:r>
+          </w:p>
+        </w:tc>
+        <w:tc>
+          <w:tcPr>
+            <w:tcW w:type="dxa" w:w="1512"/>
+            <w:tcMar>
+              <w:top w:w="60" w:type="dxa"/>
+              <w:bottom w:w="60" w:type="dxa"/>
+              <w:left w:w="80" w:type="dxa"/>
+              <w:right w:w="80" w:type="dxa"/>
+            </w:tcMar>
+            <w:tcBorders>
+              <w:top w:val="single" w:sz="4" w:space="0" w:color="D0CEC6"/>
+              <w:left w:val="single" w:sz="4" w:space="0" w:color="D0CEC6"/>
+              <w:bottom w:val="single" w:sz="4" w:space="0" w:color="D0CEC6"/>
+              <w:right w:val="single" w:sz="4" w:space="0" w:color="D0CEC6"/>
+              <w:insideH w:val="single" w:sz="4" w:space="0" w:color="D0CEC6"/>
+              <w:insideV w:val="single" w:sz="4" w:space="0" w:color="D0CEC6"/>
+            </w:tcBorders>
+          </w:tcPr>
+          <w:p>
+            <w:r>
+              <w:rPr>
+                <w:rFonts w:ascii="Arial" w:hAnsi="Arial"/>
+                <w:color w:val="1C1C1A"/>
+                <w:sz w:val="20"/>
+              </w:rPr>
               <w:t>High</w:t>
             </w:r>
           </w:p>
         </w:tc>
         <w:tc>
           <w:tcPr>
-            <w:tcW w:type="dxa" w:w="1440"/>
+            <w:tcW w:type="dxa" w:w="1368"/>
             <w:tcMar>
               <w:top w:w="60" w:type="dxa"/>
               <w:bottom w:w="60" w:type="dxa"/>
@@ -3582,7 +4543,7 @@
         </w:tc>
         <w:tc>
           <w:tcPr>
-            <w:tcW w:type="dxa" w:w="1440"/>
+            <w:tcW w:type="dxa" w:w="1368"/>
             <w:tcMar>
               <w:top w:w="60" w:type="dxa"/>
               <w:bottom w:w="60" w:type="dxa"/>
@@ -3672,7 +4633,7 @@
         </w:tc>
         <w:tc>
           <w:tcPr>
-            <w:tcW w:type="dxa" w:w="1584"/>
+            <w:tcW w:type="dxa" w:w="1512"/>
             <w:tcMar>
               <w:top w:w="60" w:type="dxa"/>
               <w:bottom w:w="60" w:type="dxa"/>
@@ -3701,7 +4662,7 @@
         </w:tc>
         <w:tc>
           <w:tcPr>
-            <w:tcW w:type="dxa" w:w="1584"/>
+            <w:tcW w:type="dxa" w:w="1512"/>
             <w:tcMar>
               <w:top w:w="60" w:type="dxa"/>
               <w:bottom w:w="60" w:type="dxa"/>
@@ -3730,7 +4691,7 @@
         </w:tc>
         <w:tc>
           <w:tcPr>
-            <w:tcW w:type="dxa" w:w="1440"/>
+            <w:tcW w:type="dxa" w:w="1368"/>
             <w:tcMar>
               <w:top w:w="60" w:type="dxa"/>
               <w:bottom w:w="60" w:type="dxa"/>
@@ -3759,7 +4720,7 @@
         </w:tc>
         <w:tc>
           <w:tcPr>
-            <w:tcW w:type="dxa" w:w="1440"/>
+            <w:tcW w:type="dxa" w:w="1368"/>
             <w:tcMar>
               <w:top w:w="60" w:type="dxa"/>
               <w:bottom w:w="60" w:type="dxa"/>

</xml_diff>